<commit_message>
add slide ver 1
</commit_message>
<xml_diff>
--- a/master-slave/evaluate-results/danh-gia-ket-qua-2.docx
+++ b/master-slave/evaluate-results/danh-gia-ket-qua-2.docx
@@ -55,22 +55,6 @@
         <w:gridCol w:w="1870"/>
       </w:tblGrid>
       <w:tr>
-        <w:tblPrEx>
-          <w:tblBorders>
-            <w:top w:val="single" w:color="auto" w:sz="4" w:space="0"/>
-            <w:left w:val="single" w:color="auto" w:sz="4" w:space="0"/>
-            <w:bottom w:val="single" w:color="auto" w:sz="4" w:space="0"/>
-            <w:right w:val="single" w:color="auto" w:sz="4" w:space="0"/>
-            <w:insideH w:val="single" w:color="auto" w:sz="4" w:space="0"/>
-            <w:insideV w:val="single" w:color="auto" w:sz="4" w:space="0"/>
-          </w:tblBorders>
-          <w:tblCellMar>
-            <w:top w:w="0" w:type="dxa"/>
-            <w:left w:w="108" w:type="dxa"/>
-            <w:bottom w:w="0" w:type="dxa"/>
-            <w:right w:w="108" w:type="dxa"/>
-          </w:tblCellMar>
-        </w:tblPrEx>
         <w:tc>
           <w:tcPr>
             <w:tcW w:w="1870" w:type="dxa"/>
@@ -138,22 +122,6 @@
         </w:tc>
       </w:tr>
       <w:tr>
-        <w:tblPrEx>
-          <w:tblBorders>
-            <w:top w:val="single" w:color="auto" w:sz="4" w:space="0"/>
-            <w:left w:val="single" w:color="auto" w:sz="4" w:space="0"/>
-            <w:bottom w:val="single" w:color="auto" w:sz="4" w:space="0"/>
-            <w:right w:val="single" w:color="auto" w:sz="4" w:space="0"/>
-            <w:insideH w:val="single" w:color="auto" w:sz="4" w:space="0"/>
-            <w:insideV w:val="single" w:color="auto" w:sz="4" w:space="0"/>
-          </w:tblBorders>
-          <w:tblCellMar>
-            <w:top w:w="0" w:type="dxa"/>
-            <w:left w:w="108" w:type="dxa"/>
-            <w:bottom w:w="0" w:type="dxa"/>
-            <w:right w:w="108" w:type="dxa"/>
-          </w:tblCellMar>
-        </w:tblPrEx>
         <w:tc>
           <w:tcPr>
             <w:tcW w:w="1870" w:type="dxa"/>
@@ -208,22 +176,6 @@
         </w:tc>
       </w:tr>
       <w:tr>
-        <w:tblPrEx>
-          <w:tblBorders>
-            <w:top w:val="single" w:color="auto" w:sz="4" w:space="0"/>
-            <w:left w:val="single" w:color="auto" w:sz="4" w:space="0"/>
-            <w:bottom w:val="single" w:color="auto" w:sz="4" w:space="0"/>
-            <w:right w:val="single" w:color="auto" w:sz="4" w:space="0"/>
-            <w:insideH w:val="single" w:color="auto" w:sz="4" w:space="0"/>
-            <w:insideV w:val="single" w:color="auto" w:sz="4" w:space="0"/>
-          </w:tblBorders>
-          <w:tblCellMar>
-            <w:top w:w="0" w:type="dxa"/>
-            <w:left w:w="108" w:type="dxa"/>
-            <w:bottom w:w="0" w:type="dxa"/>
-            <w:right w:w="108" w:type="dxa"/>
-          </w:tblCellMar>
-        </w:tblPrEx>
         <w:tc>
           <w:tcPr>
             <w:tcW w:w="1870" w:type="dxa"/>
@@ -273,22 +225,6 @@
         </w:tc>
       </w:tr>
       <w:tr>
-        <w:tblPrEx>
-          <w:tblBorders>
-            <w:top w:val="single" w:color="auto" w:sz="4" w:space="0"/>
-            <w:left w:val="single" w:color="auto" w:sz="4" w:space="0"/>
-            <w:bottom w:val="single" w:color="auto" w:sz="4" w:space="0"/>
-            <w:right w:val="single" w:color="auto" w:sz="4" w:space="0"/>
-            <w:insideH w:val="single" w:color="auto" w:sz="4" w:space="0"/>
-            <w:insideV w:val="single" w:color="auto" w:sz="4" w:space="0"/>
-          </w:tblBorders>
-          <w:tblCellMar>
-            <w:top w:w="0" w:type="dxa"/>
-            <w:left w:w="108" w:type="dxa"/>
-            <w:bottom w:w="0" w:type="dxa"/>
-            <w:right w:w="108" w:type="dxa"/>
-          </w:tblCellMar>
-        </w:tblPrEx>
         <w:tc>
           <w:tcPr>
             <w:tcW w:w="1870" w:type="dxa"/>
@@ -338,22 +274,6 @@
         </w:tc>
       </w:tr>
       <w:tr>
-        <w:tblPrEx>
-          <w:tblBorders>
-            <w:top w:val="single" w:color="auto" w:sz="4" w:space="0"/>
-            <w:left w:val="single" w:color="auto" w:sz="4" w:space="0"/>
-            <w:bottom w:val="single" w:color="auto" w:sz="4" w:space="0"/>
-            <w:right w:val="single" w:color="auto" w:sz="4" w:space="0"/>
-            <w:insideH w:val="single" w:color="auto" w:sz="4" w:space="0"/>
-            <w:insideV w:val="single" w:color="auto" w:sz="4" w:space="0"/>
-          </w:tblBorders>
-          <w:tblCellMar>
-            <w:top w:w="0" w:type="dxa"/>
-            <w:left w:w="108" w:type="dxa"/>
-            <w:bottom w:w="0" w:type="dxa"/>
-            <w:right w:w="108" w:type="dxa"/>
-          </w:tblCellMar>
-        </w:tblPrEx>
         <w:tc>
           <w:tcPr>
             <w:tcW w:w="1870" w:type="dxa"/>
@@ -408,22 +328,6 @@
         </w:tc>
       </w:tr>
       <w:tr>
-        <w:tblPrEx>
-          <w:tblBorders>
-            <w:top w:val="single" w:color="auto" w:sz="4" w:space="0"/>
-            <w:left w:val="single" w:color="auto" w:sz="4" w:space="0"/>
-            <w:bottom w:val="single" w:color="auto" w:sz="4" w:space="0"/>
-            <w:right w:val="single" w:color="auto" w:sz="4" w:space="0"/>
-            <w:insideH w:val="single" w:color="auto" w:sz="4" w:space="0"/>
-            <w:insideV w:val="single" w:color="auto" w:sz="4" w:space="0"/>
-          </w:tblBorders>
-          <w:tblCellMar>
-            <w:top w:w="0" w:type="dxa"/>
-            <w:left w:w="108" w:type="dxa"/>
-            <w:bottom w:w="0" w:type="dxa"/>
-            <w:right w:w="108" w:type="dxa"/>
-          </w:tblCellMar>
-        </w:tblPrEx>
         <w:tc>
           <w:tcPr>
             <w:tcW w:w="1870" w:type="dxa"/>
@@ -473,22 +377,6 @@
         </w:tc>
       </w:tr>
       <w:tr>
-        <w:tblPrEx>
-          <w:tblBorders>
-            <w:top w:val="single" w:color="auto" w:sz="4" w:space="0"/>
-            <w:left w:val="single" w:color="auto" w:sz="4" w:space="0"/>
-            <w:bottom w:val="single" w:color="auto" w:sz="4" w:space="0"/>
-            <w:right w:val="single" w:color="auto" w:sz="4" w:space="0"/>
-            <w:insideH w:val="single" w:color="auto" w:sz="4" w:space="0"/>
-            <w:insideV w:val="single" w:color="auto" w:sz="4" w:space="0"/>
-          </w:tblBorders>
-          <w:tblCellMar>
-            <w:top w:w="0" w:type="dxa"/>
-            <w:left w:w="108" w:type="dxa"/>
-            <w:bottom w:w="0" w:type="dxa"/>
-            <w:right w:w="108" w:type="dxa"/>
-          </w:tblCellMar>
-        </w:tblPrEx>
         <w:tc>
           <w:tcPr>
             <w:tcW w:w="1870" w:type="dxa"/>
@@ -975,22 +863,6 @@
         <w:gridCol w:w="915"/>
       </w:tblGrid>
       <w:tr>
-        <w:tblPrEx>
-          <w:tblBorders>
-            <w:top w:val="single" w:color="auto" w:sz="4" w:space="0"/>
-            <w:left w:val="single" w:color="auto" w:sz="4" w:space="0"/>
-            <w:bottom w:val="single" w:color="auto" w:sz="4" w:space="0"/>
-            <w:right w:val="single" w:color="auto" w:sz="4" w:space="0"/>
-            <w:insideH w:val="single" w:color="auto" w:sz="4" w:space="0"/>
-            <w:insideV w:val="single" w:color="auto" w:sz="4" w:space="0"/>
-          </w:tblBorders>
-          <w:tblCellMar>
-            <w:top w:w="0" w:type="dxa"/>
-            <w:left w:w="108" w:type="dxa"/>
-            <w:bottom w:w="0" w:type="dxa"/>
-            <w:right w:w="108" w:type="dxa"/>
-          </w:tblCellMar>
-        </w:tblPrEx>
         <w:tc>
           <w:tcPr>
             <w:tcW w:w="877" w:type="dxa"/>
@@ -1049,22 +921,6 @@
         </w:tc>
       </w:tr>
       <w:tr>
-        <w:tblPrEx>
-          <w:tblBorders>
-            <w:top w:val="single" w:color="auto" w:sz="4" w:space="0"/>
-            <w:left w:val="single" w:color="auto" w:sz="4" w:space="0"/>
-            <w:bottom w:val="single" w:color="auto" w:sz="4" w:space="0"/>
-            <w:right w:val="single" w:color="auto" w:sz="4" w:space="0"/>
-            <w:insideH w:val="single" w:color="auto" w:sz="4" w:space="0"/>
-            <w:insideV w:val="single" w:color="auto" w:sz="4" w:space="0"/>
-          </w:tblBorders>
-          <w:tblCellMar>
-            <w:top w:w="0" w:type="dxa"/>
-            <w:left w:w="108" w:type="dxa"/>
-            <w:bottom w:w="0" w:type="dxa"/>
-            <w:right w:w="108" w:type="dxa"/>
-          </w:tblCellMar>
-        </w:tblPrEx>
         <w:tc>
           <w:tcPr>
             <w:tcW w:w="877" w:type="dxa"/>
@@ -1174,22 +1030,6 @@
         </w:tc>
       </w:tr>
       <w:tr>
-        <w:tblPrEx>
-          <w:tblBorders>
-            <w:top w:val="single" w:color="auto" w:sz="4" w:space="0"/>
-            <w:left w:val="single" w:color="auto" w:sz="4" w:space="0"/>
-            <w:bottom w:val="single" w:color="auto" w:sz="4" w:space="0"/>
-            <w:right w:val="single" w:color="auto" w:sz="4" w:space="0"/>
-            <w:insideH w:val="single" w:color="auto" w:sz="4" w:space="0"/>
-            <w:insideV w:val="single" w:color="auto" w:sz="4" w:space="0"/>
-          </w:tblBorders>
-          <w:tblCellMar>
-            <w:top w:w="0" w:type="dxa"/>
-            <w:left w:w="108" w:type="dxa"/>
-            <w:bottom w:w="0" w:type="dxa"/>
-            <w:right w:w="108" w:type="dxa"/>
-          </w:tblCellMar>
-        </w:tblPrEx>
         <w:tc>
           <w:tcPr>
             <w:tcW w:w="877" w:type="dxa"/>
@@ -1368,22 +1208,6 @@
         </w:tc>
       </w:tr>
       <w:tr>
-        <w:tblPrEx>
-          <w:tblBorders>
-            <w:top w:val="single" w:color="auto" w:sz="4" w:space="0"/>
-            <w:left w:val="single" w:color="auto" w:sz="4" w:space="0"/>
-            <w:bottom w:val="single" w:color="auto" w:sz="4" w:space="0"/>
-            <w:right w:val="single" w:color="auto" w:sz="4" w:space="0"/>
-            <w:insideH w:val="single" w:color="auto" w:sz="4" w:space="0"/>
-            <w:insideV w:val="single" w:color="auto" w:sz="4" w:space="0"/>
-          </w:tblBorders>
-          <w:tblCellMar>
-            <w:top w:w="0" w:type="dxa"/>
-            <w:left w:w="108" w:type="dxa"/>
-            <w:bottom w:w="0" w:type="dxa"/>
-            <w:right w:w="108" w:type="dxa"/>
-          </w:tblCellMar>
-        </w:tblPrEx>
         <w:tc>
           <w:tcPr>
             <w:tcW w:w="877" w:type="dxa"/>
@@ -1688,22 +1512,6 @@
         </w:tc>
       </w:tr>
       <w:tr>
-        <w:tblPrEx>
-          <w:tblBorders>
-            <w:top w:val="single" w:color="auto" w:sz="4" w:space="0"/>
-            <w:left w:val="single" w:color="auto" w:sz="4" w:space="0"/>
-            <w:bottom w:val="single" w:color="auto" w:sz="4" w:space="0"/>
-            <w:right w:val="single" w:color="auto" w:sz="4" w:space="0"/>
-            <w:insideH w:val="single" w:color="auto" w:sz="4" w:space="0"/>
-            <w:insideV w:val="single" w:color="auto" w:sz="4" w:space="0"/>
-          </w:tblBorders>
-          <w:tblCellMar>
-            <w:top w:w="0" w:type="dxa"/>
-            <w:left w:w="108" w:type="dxa"/>
-            <w:bottom w:w="0" w:type="dxa"/>
-            <w:right w:w="108" w:type="dxa"/>
-          </w:tblCellMar>
-        </w:tblPrEx>
         <w:tc>
           <w:tcPr>
             <w:tcW w:w="877" w:type="dxa"/>
@@ -2003,22 +1811,6 @@
         </w:tc>
       </w:tr>
       <w:tr>
-        <w:tblPrEx>
-          <w:tblBorders>
-            <w:top w:val="single" w:color="auto" w:sz="4" w:space="0"/>
-            <w:left w:val="single" w:color="auto" w:sz="4" w:space="0"/>
-            <w:bottom w:val="single" w:color="auto" w:sz="4" w:space="0"/>
-            <w:right w:val="single" w:color="auto" w:sz="4" w:space="0"/>
-            <w:insideH w:val="single" w:color="auto" w:sz="4" w:space="0"/>
-            <w:insideV w:val="single" w:color="auto" w:sz="4" w:space="0"/>
-          </w:tblBorders>
-          <w:tblCellMar>
-            <w:top w:w="0" w:type="dxa"/>
-            <w:left w:w="108" w:type="dxa"/>
-            <w:bottom w:w="0" w:type="dxa"/>
-            <w:right w:w="108" w:type="dxa"/>
-          </w:tblCellMar>
-        </w:tblPrEx>
         <w:tc>
           <w:tcPr>
             <w:tcW w:w="877" w:type="dxa"/>
@@ -2318,22 +2110,6 @@
         </w:tc>
       </w:tr>
       <w:tr>
-        <w:tblPrEx>
-          <w:tblBorders>
-            <w:top w:val="single" w:color="auto" w:sz="4" w:space="0"/>
-            <w:left w:val="single" w:color="auto" w:sz="4" w:space="0"/>
-            <w:bottom w:val="single" w:color="auto" w:sz="4" w:space="0"/>
-            <w:right w:val="single" w:color="auto" w:sz="4" w:space="0"/>
-            <w:insideH w:val="single" w:color="auto" w:sz="4" w:space="0"/>
-            <w:insideV w:val="single" w:color="auto" w:sz="4" w:space="0"/>
-          </w:tblBorders>
-          <w:tblCellMar>
-            <w:top w:w="0" w:type="dxa"/>
-            <w:left w:w="108" w:type="dxa"/>
-            <w:bottom w:w="0" w:type="dxa"/>
-            <w:right w:w="108" w:type="dxa"/>
-          </w:tblCellMar>
-        </w:tblPrEx>
         <w:tc>
           <w:tcPr>
             <w:tcW w:w="877" w:type="dxa"/>
@@ -2638,22 +2414,6 @@
         </w:tc>
       </w:tr>
       <w:tr>
-        <w:tblPrEx>
-          <w:tblBorders>
-            <w:top w:val="single" w:color="auto" w:sz="4" w:space="0"/>
-            <w:left w:val="single" w:color="auto" w:sz="4" w:space="0"/>
-            <w:bottom w:val="single" w:color="auto" w:sz="4" w:space="0"/>
-            <w:right w:val="single" w:color="auto" w:sz="4" w:space="0"/>
-            <w:insideH w:val="single" w:color="auto" w:sz="4" w:space="0"/>
-            <w:insideV w:val="single" w:color="auto" w:sz="4" w:space="0"/>
-          </w:tblBorders>
-          <w:tblCellMar>
-            <w:top w:w="0" w:type="dxa"/>
-            <w:left w:w="108" w:type="dxa"/>
-            <w:bottom w:w="0" w:type="dxa"/>
-            <w:right w:w="108" w:type="dxa"/>
-          </w:tblCellMar>
-        </w:tblPrEx>
         <w:tc>
           <w:tcPr>
             <w:tcW w:w="877" w:type="dxa"/>
@@ -2959,22 +2719,6 @@
         </w:tc>
       </w:tr>
       <w:tr>
-        <w:tblPrEx>
-          <w:tblBorders>
-            <w:top w:val="single" w:color="auto" w:sz="4" w:space="0"/>
-            <w:left w:val="single" w:color="auto" w:sz="4" w:space="0"/>
-            <w:bottom w:val="single" w:color="auto" w:sz="4" w:space="0"/>
-            <w:right w:val="single" w:color="auto" w:sz="4" w:space="0"/>
-            <w:insideH w:val="single" w:color="auto" w:sz="4" w:space="0"/>
-            <w:insideV w:val="single" w:color="auto" w:sz="4" w:space="0"/>
-          </w:tblBorders>
-          <w:tblCellMar>
-            <w:top w:w="0" w:type="dxa"/>
-            <w:left w:w="108" w:type="dxa"/>
-            <w:bottom w:w="0" w:type="dxa"/>
-            <w:right w:w="108" w:type="dxa"/>
-          </w:tblCellMar>
-        </w:tblPrEx>
         <w:tc>
           <w:tcPr>
             <w:tcW w:w="877" w:type="dxa"/>
@@ -3274,22 +3018,6 @@
         </w:tc>
       </w:tr>
       <w:tr>
-        <w:tblPrEx>
-          <w:tblBorders>
-            <w:top w:val="single" w:color="auto" w:sz="4" w:space="0"/>
-            <w:left w:val="single" w:color="auto" w:sz="4" w:space="0"/>
-            <w:bottom w:val="single" w:color="auto" w:sz="4" w:space="0"/>
-            <w:right w:val="single" w:color="auto" w:sz="4" w:space="0"/>
-            <w:insideH w:val="single" w:color="auto" w:sz="4" w:space="0"/>
-            <w:insideV w:val="single" w:color="auto" w:sz="4" w:space="0"/>
-          </w:tblBorders>
-          <w:tblCellMar>
-            <w:top w:w="0" w:type="dxa"/>
-            <w:left w:w="108" w:type="dxa"/>
-            <w:bottom w:w="0" w:type="dxa"/>
-            <w:right w:w="108" w:type="dxa"/>
-          </w:tblCellMar>
-        </w:tblPrEx>
         <w:tc>
           <w:tcPr>
             <w:tcW w:w="877" w:type="dxa"/>
@@ -3594,22 +3322,6 @@
         </w:tc>
       </w:tr>
       <w:tr>
-        <w:tblPrEx>
-          <w:tblBorders>
-            <w:top w:val="single" w:color="auto" w:sz="4" w:space="0"/>
-            <w:left w:val="single" w:color="auto" w:sz="4" w:space="0"/>
-            <w:bottom w:val="single" w:color="auto" w:sz="4" w:space="0"/>
-            <w:right w:val="single" w:color="auto" w:sz="4" w:space="0"/>
-            <w:insideH w:val="single" w:color="auto" w:sz="4" w:space="0"/>
-            <w:insideV w:val="single" w:color="auto" w:sz="4" w:space="0"/>
-          </w:tblBorders>
-          <w:tblCellMar>
-            <w:top w:w="0" w:type="dxa"/>
-            <w:left w:w="108" w:type="dxa"/>
-            <w:bottom w:w="0" w:type="dxa"/>
-            <w:right w:w="108" w:type="dxa"/>
-          </w:tblCellMar>
-        </w:tblPrEx>
         <w:tc>
           <w:tcPr>
             <w:tcW w:w="877" w:type="dxa"/>
@@ -3909,22 +3621,6 @@
         </w:tc>
       </w:tr>
       <w:tr>
-        <w:tblPrEx>
-          <w:tblBorders>
-            <w:top w:val="single" w:color="auto" w:sz="4" w:space="0"/>
-            <w:left w:val="single" w:color="auto" w:sz="4" w:space="0"/>
-            <w:bottom w:val="single" w:color="auto" w:sz="4" w:space="0"/>
-            <w:right w:val="single" w:color="auto" w:sz="4" w:space="0"/>
-            <w:insideH w:val="single" w:color="auto" w:sz="4" w:space="0"/>
-            <w:insideV w:val="single" w:color="auto" w:sz="4" w:space="0"/>
-          </w:tblBorders>
-          <w:tblCellMar>
-            <w:top w:w="0" w:type="dxa"/>
-            <w:left w:w="108" w:type="dxa"/>
-            <w:bottom w:w="0" w:type="dxa"/>
-            <w:right w:w="108" w:type="dxa"/>
-          </w:tblCellMar>
-        </w:tblPrEx>
         <w:tc>
           <w:tcPr>
             <w:tcW w:w="877" w:type="dxa"/>
@@ -4730,22 +4426,6 @@
         <w:gridCol w:w="651"/>
       </w:tblGrid>
       <w:tr>
-        <w:tblPrEx>
-          <w:tblBorders>
-            <w:top w:val="single" w:color="auto" w:sz="4" w:space="0"/>
-            <w:left w:val="single" w:color="auto" w:sz="4" w:space="0"/>
-            <w:bottom w:val="single" w:color="auto" w:sz="4" w:space="0"/>
-            <w:right w:val="single" w:color="auto" w:sz="4" w:space="0"/>
-            <w:insideH w:val="single" w:color="auto" w:sz="4" w:space="0"/>
-            <w:insideV w:val="single" w:color="auto" w:sz="4" w:space="0"/>
-          </w:tblBorders>
-          <w:tblCellMar>
-            <w:top w:w="0" w:type="dxa"/>
-            <w:left w:w="108" w:type="dxa"/>
-            <w:bottom w:w="0" w:type="dxa"/>
-            <w:right w:w="108" w:type="dxa"/>
-          </w:tblCellMar>
-        </w:tblPrEx>
         <w:tc>
           <w:tcPr>
             <w:tcW w:w="1548" w:type="dxa"/>
@@ -4801,22 +4481,6 @@
         </w:tc>
       </w:tr>
       <w:tr>
-        <w:tblPrEx>
-          <w:tblBorders>
-            <w:top w:val="single" w:color="auto" w:sz="4" w:space="0"/>
-            <w:left w:val="single" w:color="auto" w:sz="4" w:space="0"/>
-            <w:bottom w:val="single" w:color="auto" w:sz="4" w:space="0"/>
-            <w:right w:val="single" w:color="auto" w:sz="4" w:space="0"/>
-            <w:insideH w:val="single" w:color="auto" w:sz="4" w:space="0"/>
-            <w:insideV w:val="single" w:color="auto" w:sz="4" w:space="0"/>
-          </w:tblBorders>
-          <w:tblCellMar>
-            <w:top w:w="0" w:type="dxa"/>
-            <w:left w:w="108" w:type="dxa"/>
-            <w:bottom w:w="0" w:type="dxa"/>
-            <w:right w:w="108" w:type="dxa"/>
-          </w:tblCellMar>
-        </w:tblPrEx>
         <w:tc>
           <w:tcPr>
             <w:tcW w:w="1548" w:type="dxa"/>
@@ -4942,22 +4606,6 @@
         </w:tc>
       </w:tr>
       <w:tr>
-        <w:tblPrEx>
-          <w:tblBorders>
-            <w:top w:val="single" w:color="auto" w:sz="4" w:space="0"/>
-            <w:left w:val="single" w:color="auto" w:sz="4" w:space="0"/>
-            <w:bottom w:val="single" w:color="auto" w:sz="4" w:space="0"/>
-            <w:right w:val="single" w:color="auto" w:sz="4" w:space="0"/>
-            <w:insideH w:val="single" w:color="auto" w:sz="4" w:space="0"/>
-            <w:insideV w:val="single" w:color="auto" w:sz="4" w:space="0"/>
-          </w:tblBorders>
-          <w:tblCellMar>
-            <w:top w:w="0" w:type="dxa"/>
-            <w:left w:w="108" w:type="dxa"/>
-            <w:bottom w:w="0" w:type="dxa"/>
-            <w:right w:w="108" w:type="dxa"/>
-          </w:tblCellMar>
-        </w:tblPrEx>
         <w:tc>
           <w:tcPr>
             <w:tcW w:w="1548" w:type="dxa"/>
@@ -5310,22 +4958,6 @@
         </w:tc>
       </w:tr>
       <w:tr>
-        <w:tblPrEx>
-          <w:tblBorders>
-            <w:top w:val="single" w:color="auto" w:sz="4" w:space="0"/>
-            <w:left w:val="single" w:color="auto" w:sz="4" w:space="0"/>
-            <w:bottom w:val="single" w:color="auto" w:sz="4" w:space="0"/>
-            <w:right w:val="single" w:color="auto" w:sz="4" w:space="0"/>
-            <w:insideH w:val="single" w:color="auto" w:sz="4" w:space="0"/>
-            <w:insideV w:val="single" w:color="auto" w:sz="4" w:space="0"/>
-          </w:tblBorders>
-          <w:tblCellMar>
-            <w:top w:w="0" w:type="dxa"/>
-            <w:left w:w="108" w:type="dxa"/>
-            <w:bottom w:w="0" w:type="dxa"/>
-            <w:right w:w="108" w:type="dxa"/>
-          </w:tblCellMar>
-        </w:tblPrEx>
         <w:tc>
           <w:tcPr>
             <w:tcW w:w="1548" w:type="dxa"/>
@@ -5710,22 +5342,6 @@
         </w:tc>
       </w:tr>
       <w:tr>
-        <w:tblPrEx>
-          <w:tblBorders>
-            <w:top w:val="single" w:color="auto" w:sz="4" w:space="0"/>
-            <w:left w:val="single" w:color="auto" w:sz="4" w:space="0"/>
-            <w:bottom w:val="single" w:color="auto" w:sz="4" w:space="0"/>
-            <w:right w:val="single" w:color="auto" w:sz="4" w:space="0"/>
-            <w:insideH w:val="single" w:color="auto" w:sz="4" w:space="0"/>
-            <w:insideV w:val="single" w:color="auto" w:sz="4" w:space="0"/>
-          </w:tblBorders>
-          <w:tblCellMar>
-            <w:top w:w="0" w:type="dxa"/>
-            <w:left w:w="108" w:type="dxa"/>
-            <w:bottom w:w="0" w:type="dxa"/>
-            <w:right w:w="108" w:type="dxa"/>
-          </w:tblCellMar>
-        </w:tblPrEx>
         <w:tc>
           <w:tcPr>
             <w:tcW w:w="1548" w:type="dxa"/>
@@ -6110,22 +5726,6 @@
         </w:tc>
       </w:tr>
       <w:tr>
-        <w:tblPrEx>
-          <w:tblBorders>
-            <w:top w:val="single" w:color="auto" w:sz="4" w:space="0"/>
-            <w:left w:val="single" w:color="auto" w:sz="4" w:space="0"/>
-            <w:bottom w:val="single" w:color="auto" w:sz="4" w:space="0"/>
-            <w:right w:val="single" w:color="auto" w:sz="4" w:space="0"/>
-            <w:insideH w:val="single" w:color="auto" w:sz="4" w:space="0"/>
-            <w:insideV w:val="single" w:color="auto" w:sz="4" w:space="0"/>
-          </w:tblBorders>
-          <w:tblCellMar>
-            <w:top w:w="0" w:type="dxa"/>
-            <w:left w:w="108" w:type="dxa"/>
-            <w:bottom w:w="0" w:type="dxa"/>
-            <w:right w:w="108" w:type="dxa"/>
-          </w:tblCellMar>
-        </w:tblPrEx>
         <w:tc>
           <w:tcPr>
             <w:tcW w:w="1548" w:type="dxa"/>
@@ -6514,22 +6114,6 @@
         </w:tc>
       </w:tr>
       <w:tr>
-        <w:tblPrEx>
-          <w:tblBorders>
-            <w:top w:val="single" w:color="auto" w:sz="4" w:space="0"/>
-            <w:left w:val="single" w:color="auto" w:sz="4" w:space="0"/>
-            <w:bottom w:val="single" w:color="auto" w:sz="4" w:space="0"/>
-            <w:right w:val="single" w:color="auto" w:sz="4" w:space="0"/>
-            <w:insideH w:val="single" w:color="auto" w:sz="4" w:space="0"/>
-            <w:insideV w:val="single" w:color="auto" w:sz="4" w:space="0"/>
-          </w:tblBorders>
-          <w:tblCellMar>
-            <w:top w:w="0" w:type="dxa"/>
-            <w:left w:w="108" w:type="dxa"/>
-            <w:bottom w:w="0" w:type="dxa"/>
-            <w:right w:w="108" w:type="dxa"/>
-          </w:tblCellMar>
-        </w:tblPrEx>
         <w:tc>
           <w:tcPr>
             <w:tcW w:w="1548" w:type="dxa"/>
@@ -6918,22 +6502,6 @@
         </w:tc>
       </w:tr>
       <w:tr>
-        <w:tblPrEx>
-          <w:tblBorders>
-            <w:top w:val="single" w:color="auto" w:sz="4" w:space="0"/>
-            <w:left w:val="single" w:color="auto" w:sz="4" w:space="0"/>
-            <w:bottom w:val="single" w:color="auto" w:sz="4" w:space="0"/>
-            <w:right w:val="single" w:color="auto" w:sz="4" w:space="0"/>
-            <w:insideH w:val="single" w:color="auto" w:sz="4" w:space="0"/>
-            <w:insideV w:val="single" w:color="auto" w:sz="4" w:space="0"/>
-          </w:tblBorders>
-          <w:tblCellMar>
-            <w:top w:w="0" w:type="dxa"/>
-            <w:left w:w="108" w:type="dxa"/>
-            <w:bottom w:w="0" w:type="dxa"/>
-            <w:right w:w="108" w:type="dxa"/>
-          </w:tblCellMar>
-        </w:tblPrEx>
         <w:tc>
           <w:tcPr>
             <w:tcW w:w="1548" w:type="dxa"/>
@@ -7322,22 +6890,6 @@
         </w:tc>
       </w:tr>
       <w:tr>
-        <w:tblPrEx>
-          <w:tblBorders>
-            <w:top w:val="single" w:color="auto" w:sz="4" w:space="0"/>
-            <w:left w:val="single" w:color="auto" w:sz="4" w:space="0"/>
-            <w:bottom w:val="single" w:color="auto" w:sz="4" w:space="0"/>
-            <w:right w:val="single" w:color="auto" w:sz="4" w:space="0"/>
-            <w:insideH w:val="single" w:color="auto" w:sz="4" w:space="0"/>
-            <w:insideV w:val="single" w:color="auto" w:sz="4" w:space="0"/>
-          </w:tblBorders>
-          <w:tblCellMar>
-            <w:top w:w="0" w:type="dxa"/>
-            <w:left w:w="108" w:type="dxa"/>
-            <w:bottom w:w="0" w:type="dxa"/>
-            <w:right w:w="108" w:type="dxa"/>
-          </w:tblCellMar>
-        </w:tblPrEx>
         <w:tc>
           <w:tcPr>
             <w:tcW w:w="1548" w:type="dxa"/>
@@ -7878,6 +7430,8 @@
       <w:r>
         <w:t>Nghiệm cuối cùng tìm được tại: 11935.5 ms</w:t>
       </w:r>
+      <w:bookmarkStart w:id="0" w:name="_GoBack"/>
+      <w:bookmarkEnd w:id="0"/>
     </w:p>
     <w:p>
       <w:pPr>
@@ -8357,8 +7911,6 @@
         </w:rPr>
         <w:t xml:space="preserve"> Kết quả có xu hướng tốt dần khi tăng số lượng worker do càng nhiều worker thì độ đa dạng càng cao. Thời gian chạy tăng dần khi tăng số worker.</w:t>
       </w:r>
-      <w:bookmarkStart w:id="0" w:name="_GoBack"/>
-      <w:bookmarkEnd w:id="0"/>
     </w:p>
     <w:tbl>
       <w:tblPr>
@@ -8391,22 +7943,6 @@
         <w:gridCol w:w="1530"/>
       </w:tblGrid>
       <w:tr>
-        <w:tblPrEx>
-          <w:tblBorders>
-            <w:top w:val="single" w:color="auto" w:sz="4" w:space="0"/>
-            <w:left w:val="single" w:color="auto" w:sz="4" w:space="0"/>
-            <w:bottom w:val="single" w:color="auto" w:sz="4" w:space="0"/>
-            <w:right w:val="single" w:color="auto" w:sz="4" w:space="0"/>
-            <w:insideH w:val="single" w:color="auto" w:sz="4" w:space="0"/>
-            <w:insideV w:val="single" w:color="auto" w:sz="4" w:space="0"/>
-          </w:tblBorders>
-          <w:tblCellMar>
-            <w:top w:w="0" w:type="dxa"/>
-            <w:left w:w="108" w:type="dxa"/>
-            <w:bottom w:w="0" w:type="dxa"/>
-            <w:right w:w="108" w:type="dxa"/>
-          </w:tblCellMar>
-        </w:tblPrEx>
         <w:tc>
           <w:tcPr>
             <w:tcW w:w="1313" w:type="dxa"/>
@@ -8500,22 +8036,6 @@
         </w:tc>
       </w:tr>
       <w:tr>
-        <w:tblPrEx>
-          <w:tblBorders>
-            <w:top w:val="single" w:color="auto" w:sz="4" w:space="0"/>
-            <w:left w:val="single" w:color="auto" w:sz="4" w:space="0"/>
-            <w:bottom w:val="single" w:color="auto" w:sz="4" w:space="0"/>
-            <w:right w:val="single" w:color="auto" w:sz="4" w:space="0"/>
-            <w:insideH w:val="single" w:color="auto" w:sz="4" w:space="0"/>
-            <w:insideV w:val="single" w:color="auto" w:sz="4" w:space="0"/>
-          </w:tblBorders>
-          <w:tblCellMar>
-            <w:top w:w="0" w:type="dxa"/>
-            <w:left w:w="108" w:type="dxa"/>
-            <w:bottom w:w="0" w:type="dxa"/>
-            <w:right w:w="108" w:type="dxa"/>
-          </w:tblCellMar>
-        </w:tblPrEx>
         <w:tc>
           <w:tcPr>
             <w:tcW w:w="1313" w:type="dxa"/>
@@ -8559,7 +8079,7 @@
         <w:tc>
           <w:tcPr>
             <w:tcW w:w="1320" w:type="dxa"/>
-            <w:shd w:val="clear"/>
+            <w:shd w:val="clear" w:color="auto" w:fill="auto"/>
             <w:vAlign w:val="top"/>
           </w:tcPr>
           <w:p>
@@ -8658,22 +8178,6 @@
         </w:tc>
       </w:tr>
       <w:tr>
-        <w:tblPrEx>
-          <w:tblBorders>
-            <w:top w:val="single" w:color="auto" w:sz="4" w:space="0"/>
-            <w:left w:val="single" w:color="auto" w:sz="4" w:space="0"/>
-            <w:bottom w:val="single" w:color="auto" w:sz="4" w:space="0"/>
-            <w:right w:val="single" w:color="auto" w:sz="4" w:space="0"/>
-            <w:insideH w:val="single" w:color="auto" w:sz="4" w:space="0"/>
-            <w:insideV w:val="single" w:color="auto" w:sz="4" w:space="0"/>
-          </w:tblBorders>
-          <w:tblCellMar>
-            <w:top w:w="0" w:type="dxa"/>
-            <w:left w:w="108" w:type="dxa"/>
-            <w:bottom w:w="0" w:type="dxa"/>
-            <w:right w:w="108" w:type="dxa"/>
-          </w:tblCellMar>
-        </w:tblPrEx>
         <w:tc>
           <w:tcPr>
             <w:tcW w:w="1313" w:type="dxa"/>
@@ -8717,7 +8221,7 @@
         <w:tc>
           <w:tcPr>
             <w:tcW w:w="1320" w:type="dxa"/>
-            <w:shd w:val="clear"/>
+            <w:shd w:val="clear" w:color="auto" w:fill="auto"/>
             <w:vAlign w:val="top"/>
           </w:tcPr>
           <w:p>
@@ -8816,22 +8320,6 @@
         </w:tc>
       </w:tr>
       <w:tr>
-        <w:tblPrEx>
-          <w:tblBorders>
-            <w:top w:val="single" w:color="auto" w:sz="4" w:space="0"/>
-            <w:left w:val="single" w:color="auto" w:sz="4" w:space="0"/>
-            <w:bottom w:val="single" w:color="auto" w:sz="4" w:space="0"/>
-            <w:right w:val="single" w:color="auto" w:sz="4" w:space="0"/>
-            <w:insideH w:val="single" w:color="auto" w:sz="4" w:space="0"/>
-            <w:insideV w:val="single" w:color="auto" w:sz="4" w:space="0"/>
-          </w:tblBorders>
-          <w:tblCellMar>
-            <w:top w:w="0" w:type="dxa"/>
-            <w:left w:w="108" w:type="dxa"/>
-            <w:bottom w:w="0" w:type="dxa"/>
-            <w:right w:w="108" w:type="dxa"/>
-          </w:tblCellMar>
-        </w:tblPrEx>
         <w:tc>
           <w:tcPr>
             <w:tcW w:w="1313" w:type="dxa"/>
@@ -8875,7 +8363,7 @@
         <w:tc>
           <w:tcPr>
             <w:tcW w:w="1320" w:type="dxa"/>
-            <w:shd w:val="clear"/>
+            <w:shd w:val="clear" w:color="auto" w:fill="auto"/>
             <w:vAlign w:val="top"/>
           </w:tcPr>
           <w:p>
@@ -8974,22 +8462,6 @@
         </w:tc>
       </w:tr>
       <w:tr>
-        <w:tblPrEx>
-          <w:tblBorders>
-            <w:top w:val="single" w:color="auto" w:sz="4" w:space="0"/>
-            <w:left w:val="single" w:color="auto" w:sz="4" w:space="0"/>
-            <w:bottom w:val="single" w:color="auto" w:sz="4" w:space="0"/>
-            <w:right w:val="single" w:color="auto" w:sz="4" w:space="0"/>
-            <w:insideH w:val="single" w:color="auto" w:sz="4" w:space="0"/>
-            <w:insideV w:val="single" w:color="auto" w:sz="4" w:space="0"/>
-          </w:tblBorders>
-          <w:tblCellMar>
-            <w:top w:w="0" w:type="dxa"/>
-            <w:left w:w="108" w:type="dxa"/>
-            <w:bottom w:w="0" w:type="dxa"/>
-            <w:right w:w="108" w:type="dxa"/>
-          </w:tblCellMar>
-        </w:tblPrEx>
         <w:tc>
           <w:tcPr>
             <w:tcW w:w="1313" w:type="dxa"/>
@@ -9033,7 +8505,7 @@
         <w:tc>
           <w:tcPr>
             <w:tcW w:w="1320" w:type="dxa"/>
-            <w:shd w:val="clear"/>
+            <w:shd w:val="clear" w:color="auto" w:fill="auto"/>
             <w:vAlign w:val="top"/>
           </w:tcPr>
           <w:p>
@@ -9950,9 +9422,9 @@
     <w:lsdException w:qFormat="1" w:unhideWhenUsed="0" w:uiPriority="39" w:semiHidden="0" w:name="Table Grid"/>
     <w:lsdException w:uiPriority="99" w:name="Table Theme"/>
     <w:lsdException w:qFormat="1" w:unhideWhenUsed="0" w:uiPriority="99" w:name="Placeholder Text"/>
-    <w:lsdException w:qFormat="1" w:unhideWhenUsed="0" w:uiPriority="60" w:semiHidden="0" w:name="Light Shading"/>
+    <w:lsdException w:unhideWhenUsed="0" w:uiPriority="60" w:semiHidden="0" w:name="Light Shading"/>
     <w:lsdException w:unhideWhenUsed="0" w:uiPriority="61" w:semiHidden="0" w:name="Light List"/>
-    <w:lsdException w:qFormat="1" w:unhideWhenUsed="0" w:uiPriority="62" w:semiHidden="0" w:name="Light Grid"/>
+    <w:lsdException w:unhideWhenUsed="0" w:uiPriority="62" w:semiHidden="0" w:name="Light Grid"/>
     <w:lsdException w:unhideWhenUsed="0" w:uiPriority="63" w:semiHidden="0" w:name="Medium Shading 1"/>
     <w:lsdException w:unhideWhenUsed="0" w:uiPriority="64" w:semiHidden="0" w:name="Medium Shading 2"/>
     <w:lsdException w:unhideWhenUsed="0" w:uiPriority="65" w:semiHidden="0" w:name="Medium List 1"/>
@@ -9964,8 +9436,8 @@
     <w:lsdException w:unhideWhenUsed="0" w:uiPriority="71" w:semiHidden="0" w:name="Colorful Shading"/>
     <w:lsdException w:unhideWhenUsed="0" w:uiPriority="72" w:semiHidden="0" w:name="Colorful List"/>
     <w:lsdException w:unhideWhenUsed="0" w:uiPriority="73" w:semiHidden="0" w:name="Colorful Grid"/>
-    <w:lsdException w:qFormat="1" w:unhideWhenUsed="0" w:uiPriority="60" w:semiHidden="0" w:name="Light Shading Accent 1"/>
-    <w:lsdException w:qFormat="1" w:unhideWhenUsed="0" w:uiPriority="61" w:semiHidden="0" w:name="Light List Accent 1"/>
+    <w:lsdException w:unhideWhenUsed="0" w:uiPriority="60" w:semiHidden="0" w:name="Light Shading Accent 1"/>
+    <w:lsdException w:unhideWhenUsed="0" w:uiPriority="61" w:semiHidden="0" w:name="Light List Accent 1"/>
     <w:lsdException w:unhideWhenUsed="0" w:uiPriority="62" w:semiHidden="0" w:name="Light Grid Accent 1"/>
     <w:lsdException w:unhideWhenUsed="0" w:uiPriority="63" w:semiHidden="0" w:name="Medium Shading 1 Accent 1"/>
     <w:lsdException w:unhideWhenUsed="0" w:uiPriority="64" w:semiHidden="0" w:name="Medium Shading 2 Accent 1"/>
@@ -9980,8 +9452,8 @@
     <w:lsdException w:unhideWhenUsed="0" w:uiPriority="72" w:semiHidden="0" w:name="Colorful List Accent 1"/>
     <w:lsdException w:unhideWhenUsed="0" w:uiPriority="73" w:semiHidden="0" w:name="Colorful Grid Accent 1"/>
     <w:lsdException w:unhideWhenUsed="0" w:uiPriority="60" w:semiHidden="0" w:name="Light Shading Accent 2"/>
-    <w:lsdException w:qFormat="1" w:unhideWhenUsed="0" w:uiPriority="61" w:semiHidden="0" w:name="Light List Accent 2"/>
-    <w:lsdException w:qFormat="1" w:unhideWhenUsed="0" w:uiPriority="62" w:semiHidden="0" w:name="Light Grid Accent 2"/>
+    <w:lsdException w:unhideWhenUsed="0" w:uiPriority="61" w:semiHidden="0" w:name="Light List Accent 2"/>
+    <w:lsdException w:unhideWhenUsed="0" w:uiPriority="62" w:semiHidden="0" w:name="Light Grid Accent 2"/>
     <w:lsdException w:unhideWhenUsed="0" w:uiPriority="63" w:semiHidden="0" w:name="Medium Shading 1 Accent 2"/>
     <w:lsdException w:unhideWhenUsed="0" w:uiPriority="64" w:semiHidden="0" w:name="Medium Shading 2 Accent 2"/>
     <w:lsdException w:unhideWhenUsed="0" w:uiPriority="65" w:semiHidden="0" w:name="Medium List 1 Accent 2"/>
@@ -9994,7 +9466,7 @@
     <w:lsdException w:unhideWhenUsed="0" w:uiPriority="72" w:semiHidden="0" w:name="Colorful List Accent 2"/>
     <w:lsdException w:unhideWhenUsed="0" w:uiPriority="73" w:semiHidden="0" w:name="Colorful Grid Accent 2"/>
     <w:lsdException w:unhideWhenUsed="0" w:uiPriority="60" w:semiHidden="0" w:name="Light Shading Accent 3"/>
-    <w:lsdException w:qFormat="1" w:unhideWhenUsed="0" w:uiPriority="61" w:semiHidden="0" w:name="Light List Accent 3"/>
+    <w:lsdException w:unhideWhenUsed="0" w:uiPriority="61" w:semiHidden="0" w:name="Light List Accent 3"/>
     <w:lsdException w:unhideWhenUsed="0" w:uiPriority="62" w:semiHidden="0" w:name="Light Grid Accent 3"/>
     <w:lsdException w:unhideWhenUsed="0" w:uiPriority="63" w:semiHidden="0" w:name="Medium Shading 1 Accent 3"/>
     <w:lsdException w:unhideWhenUsed="0" w:uiPriority="64" w:semiHidden="0" w:name="Medium Shading 2 Accent 3"/>
@@ -10007,11 +9479,11 @@
     <w:lsdException w:unhideWhenUsed="0" w:uiPriority="71" w:semiHidden="0" w:name="Colorful Shading Accent 3"/>
     <w:lsdException w:unhideWhenUsed="0" w:uiPriority="72" w:semiHidden="0" w:name="Colorful List Accent 3"/>
     <w:lsdException w:unhideWhenUsed="0" w:uiPriority="73" w:semiHidden="0" w:name="Colorful Grid Accent 3"/>
-    <w:lsdException w:qFormat="1" w:unhideWhenUsed="0" w:uiPriority="60" w:semiHidden="0" w:name="Light Shading Accent 4"/>
+    <w:lsdException w:unhideWhenUsed="0" w:uiPriority="60" w:semiHidden="0" w:name="Light Shading Accent 4"/>
     <w:lsdException w:unhideWhenUsed="0" w:uiPriority="61" w:semiHidden="0" w:name="Light List Accent 4"/>
     <w:lsdException w:unhideWhenUsed="0" w:uiPriority="62" w:semiHidden="0" w:name="Light Grid Accent 4"/>
     <w:lsdException w:unhideWhenUsed="0" w:uiPriority="63" w:semiHidden="0" w:name="Medium Shading 1 Accent 4"/>
-    <w:lsdException w:qFormat="1" w:unhideWhenUsed="0" w:uiPriority="64" w:semiHidden="0" w:name="Medium Shading 2 Accent 4"/>
+    <w:lsdException w:unhideWhenUsed="0" w:uiPriority="64" w:semiHidden="0" w:name="Medium Shading 2 Accent 4"/>
     <w:lsdException w:unhideWhenUsed="0" w:uiPriority="65" w:semiHidden="0" w:name="Medium List 1 Accent 4"/>
     <w:lsdException w:unhideWhenUsed="0" w:uiPriority="66" w:semiHidden="0" w:name="Medium List 2 Accent 4"/>
     <w:lsdException w:unhideWhenUsed="0" w:uiPriority="67" w:semiHidden="0" w:name="Medium Grid 1 Accent 4"/>
@@ -10023,7 +9495,7 @@
     <w:lsdException w:unhideWhenUsed="0" w:uiPriority="73" w:semiHidden="0" w:name="Colorful Grid Accent 4"/>
     <w:lsdException w:unhideWhenUsed="0" w:uiPriority="60" w:semiHidden="0" w:name="Light Shading Accent 5"/>
     <w:lsdException w:unhideWhenUsed="0" w:uiPriority="61" w:semiHidden="0" w:name="Light List Accent 5"/>
-    <w:lsdException w:qFormat="1" w:unhideWhenUsed="0" w:uiPriority="62" w:semiHidden="0" w:name="Light Grid Accent 5"/>
+    <w:lsdException w:unhideWhenUsed="0" w:uiPriority="62" w:semiHidden="0" w:name="Light Grid Accent 5"/>
     <w:lsdException w:unhideWhenUsed="0" w:uiPriority="63" w:semiHidden="0" w:name="Medium Shading 1 Accent 5"/>
     <w:lsdException w:unhideWhenUsed="0" w:uiPriority="64" w:semiHidden="0" w:name="Medium Shading 2 Accent 5"/>
     <w:lsdException w:unhideWhenUsed="0" w:uiPriority="65" w:semiHidden="0" w:name="Medium List 1 Accent 5"/>
@@ -10036,7 +9508,7 @@
     <w:lsdException w:unhideWhenUsed="0" w:uiPriority="72" w:semiHidden="0" w:name="Colorful List Accent 5"/>
     <w:lsdException w:unhideWhenUsed="0" w:uiPriority="73" w:semiHidden="0" w:name="Colorful Grid Accent 5"/>
     <w:lsdException w:unhideWhenUsed="0" w:uiPriority="60" w:semiHidden="0" w:name="Light Shading Accent 6"/>
-    <w:lsdException w:qFormat="1" w:unhideWhenUsed="0" w:uiPriority="61" w:semiHidden="0" w:name="Light List Accent 6"/>
+    <w:lsdException w:unhideWhenUsed="0" w:uiPriority="61" w:semiHidden="0" w:name="Light List Accent 6"/>
     <w:lsdException w:unhideWhenUsed="0" w:uiPriority="62" w:semiHidden="0" w:name="Light Grid Accent 6"/>
     <w:lsdException w:unhideWhenUsed="0" w:uiPriority="63" w:semiHidden="0" w:name="Medium Shading 1 Accent 6"/>
     <w:lsdException w:unhideWhenUsed="0" w:uiPriority="64" w:semiHidden="0" w:name="Medium Shading 2 Accent 6"/>

</xml_diff>